<commit_message>
Update docs with Postgres migration info
</commit_message>
<xml_diff>
--- a/docs/Municipal_Bylaw_Database_Developer_Manual.docx
+++ b/docs/Municipal_Bylaw_Database_Developer_Manual.docx
@@ -2707,6 +2707,78 @@
         <w:t>Historical Signal Tracking — Maintain a history of all scanner signals rather than just the most recent</w:t>
       </w:r>
     </w:p>
+    <w:p>
+      <w:pPr>
+        <w:pStyle w:val="Heading1"/>
+      </w:pPr>
+      <w:r>
+        <w:t>Architecture Update: Neon Serverless PostgreSQL Migration</w:t>
+      </w:r>
+    </w:p>
+    <w:p>
+      <w:r>
+        <w:t>Date: April 2, 2026</w:t>
+      </w:r>
+    </w:p>
+    <w:p>
+      <w:r>
+        <w:t>Due to data persistence failures arising from Streamlit Cloud's containerized ephemeral filesystem, the system architecture has been permanently migrated away from the legacy local SQLite database (bylaws.db).</w:t>
+      </w:r>
+    </w:p>
+    <w:p>
+      <w:pPr>
+        <w:pStyle w:val="Heading2"/>
+      </w:pPr>
+      <w:r>
+        <w:t>Key Upgrades</w:t>
+      </w:r>
+    </w:p>
+    <w:p>
+      <w:pPr>
+        <w:pStyle w:val="ListBullet"/>
+      </w:pPr>
+      <w:r>
+        <w:t>1. Database Engine: The native stack is now connected directly to a Neon.tech Serverless PostgreSQL cluster. The local bylaws.db file is no longer used by the production environment.</w:t>
+      </w:r>
+    </w:p>
+    <w:p>
+      <w:pPr>
+        <w:pStyle w:val="ListBullet"/>
+      </w:pPr>
+      <w:r>
+        <w:t>2. psycopg2 Python Integration: We replaced standard sqlite3 logic with psycopg2. Because the Streamlit DataFrame library native output relies heavily on Numpy, global register_adapter rules have been explicitly hardcoded into db_utils.py to ensure psycopg2 doesn't throw exceptions when rendering np.int64 variables.</w:t>
+      </w:r>
+    </w:p>
+    <w:p>
+      <w:pPr>
+        <w:pStyle w:val="ListBullet"/>
+      </w:pPr>
+      <w:r>
+        <w:t>3. Query Parameter Interpolation: The legacy SQLite wildcard marker (?) has been deprecated system-wide. All backend and GUI queries rely strictly upon strict string formatting (%s) mapped to standard Postgres parameter parsing strings.</w:t>
+      </w:r>
+    </w:p>
+    <w:p>
+      <w:pPr>
+        <w:pStyle w:val="Heading2"/>
+      </w:pPr>
+      <w:r>
+        <w:t>Future Development Guidelines</w:t>
+      </w:r>
+    </w:p>
+    <w:p>
+      <w:r>
+        <w:t xml:space="preserve">If you are writing additional reports, custom data scrapers, or altering the dashboard: </w:t>
+      </w:r>
+      <w:r>
+        <w:rPr>
+          <w:b/>
+        </w:rPr>
+        <w:t>Always format parameterized variables with %s</w:t>
+      </w:r>
+      <w:r>
+        <w:t xml:space="preserve"> instead of ?, and map bracketed columns like [exemption_status] strictly into strings surrounded by double quotes (e.g. "exemption_status").</w:t>
+      </w:r>
+    </w:p>
     <w:sectPr>
       <w:pgSz w:w="12240" w:h="15840"/>
       <w:pgMar w:top="1440" w:right="1800" w:bottom="1440" w:left="1800" w:header="720" w:footer="720" w:gutter="0"/>

</xml_diff>